<commit_message>
Add live deployment links to case study
</commit_message>
<xml_diff>
--- a/CASE_STUDY_REPORT.docx
+++ b/CASE_STUDY_REPORT.docx
@@ -305,7 +305,7 @@
         </w:numPr>
         <w:spacing w:after="70" w:line="260"/>
       </w:pPr>
-      <w:hyperlink w:history="1" r:id="rIdz2a1jq-sonunfkzckv8z_">
+      <w:hyperlink w:history="1" r:id="rIdibps3cs7ckjegdzsz4ysp">
         <w:r>
           <w:rPr>
             <w:rStyle w:val="Hyperlink"/>
@@ -337,7 +337,7 @@
         </w:numPr>
         <w:spacing w:after="70" w:line="260"/>
       </w:pPr>
-      <w:hyperlink w:history="1" r:id="rIdyy9ihhm09u30smeyxj9lq">
+      <w:hyperlink w:history="1" r:id="rId80twwtdefpx0t_0qudpsz">
         <w:r>
           <w:rPr>
             <w:rStyle w:val="Hyperlink"/>
@@ -369,7 +369,7 @@
         </w:numPr>
         <w:spacing w:after="70" w:line="260"/>
       </w:pPr>
-      <w:hyperlink w:history="1" r:id="rId31vhau3-mrx4s4_wlky9h">
+      <w:hyperlink w:history="1" r:id="rIdq5yaaq3e2a4znrn-_i-rk">
         <w:r>
           <w:rPr>
             <w:rStyle w:val="Hyperlink"/>
@@ -401,7 +401,7 @@
         </w:numPr>
         <w:spacing w:after="70" w:line="260"/>
       </w:pPr>
-      <w:hyperlink w:history="1" r:id="rIdgrgc77njakerdoz6syhbf">
+      <w:hyperlink w:history="1" r:id="rId4owcburbglp1xxlkpk4nz">
         <w:r>
           <w:rPr>
             <w:rStyle w:val="Hyperlink"/>
@@ -433,7 +433,7 @@
         </w:numPr>
         <w:spacing w:after="70" w:line="260"/>
       </w:pPr>
-      <w:hyperlink w:history="1" r:id="rId2mzhxwynqzh635cpweq5w">
+      <w:hyperlink w:history="1" r:id="rIddt6cv4qa_ymweob7t1kif">
         <w:r>
           <w:rPr>
             <w:rStyle w:val="Hyperlink"/>
@@ -852,15 +852,19 @@
         </w:rPr>
         <w:t xml:space="preserve">Live website: </w:t>
       </w:r>
-      <w:r>
-        <w:rPr>
-          <w:rFonts w:ascii="Aptos" w:cs="Aptos" w:eastAsia="Aptos" w:hAnsi="Aptos"/>
-          <w:color w:val="26332E"/>
-          <w:sz w:val="20"/>
-          <w:szCs w:val="20"/>
-        </w:rPr>
-        <w:t xml:space="preserve">[Add your deployed website URL — the current localhost preview is not publicly accessible.]</w:t>
-      </w:r>
+      <w:hyperlink w:history="1" r:id="rId_xxfd1obv6yxnph_uj-3f">
+        <w:r>
+          <w:rPr>
+            <w:rStyle w:val="Hyperlink"/>
+            <w:rFonts w:ascii="Aptos" w:cs="Aptos" w:eastAsia="Aptos" w:hAnsi="Aptos"/>
+            <w:color w:val="16846A"/>
+            <w:sz w:val="20"/>
+            <w:szCs w:val="20"/>
+            <w:u w:val="single"/>
+          </w:rPr>
+          <w:t xml:space="preserve">https://mirudhula-4227.github.io/Portfolio/</w:t>
+        </w:r>
+      </w:hyperlink>
     </w:p>
     <w:p>
       <w:pPr>
@@ -882,15 +886,19 @@
         </w:rPr>
         <w:t xml:space="preserve">GitHub: </w:t>
       </w:r>
-      <w:r>
-        <w:rPr>
-          <w:rFonts w:ascii="Aptos" w:cs="Aptos" w:eastAsia="Aptos" w:hAnsi="Aptos"/>
-          <w:color w:val="26332E"/>
-          <w:sz w:val="20"/>
-          <w:szCs w:val="20"/>
-        </w:rPr>
-        <w:t xml:space="preserve">[Add your repository URL if you publish the project; otherwise this is optional.]</w:t>
-      </w:r>
+      <w:hyperlink w:history="1" r:id="rIdyoyaefzipnumwrwbt9ul0">
+        <w:r>
+          <w:rPr>
+            <w:rStyle w:val="Hyperlink"/>
+            <w:rFonts w:ascii="Aptos" w:cs="Aptos" w:eastAsia="Aptos" w:hAnsi="Aptos"/>
+            <w:color w:val="16846A"/>
+            <w:sz w:val="20"/>
+            <w:szCs w:val="20"/>
+            <w:u w:val="single"/>
+          </w:rPr>
+          <w:t xml:space="preserve">https://github.com/Mirudhula-4227/Portfolio</w:t>
+        </w:r>
+      </w:hyperlink>
     </w:p>
     <w:p>
       <w:pPr>
@@ -914,7 +922,7 @@
           <w:sz w:val="18"/>
           <w:szCs w:val="18"/>
         </w:rPr>
-        <w:t xml:space="preserve">replace the submission link placeholders and add the actual technology stack used for each project.</w:t>
+        <w:t xml:space="preserve">add the actual technology stack used for each project.</w:t>
       </w:r>
     </w:p>
     <w:sectPr>

</xml_diff>

<commit_message>
Update project status and repository links
</commit_message>
<xml_diff>
--- a/CASE_STUDY_REPORT.docx
+++ b/CASE_STUDY_REPORT.docx
@@ -212,17 +212,103 @@
           <w:sz w:val="20"/>
           <w:szCs w:val="20"/>
         </w:rPr>
-        <w:t xml:space="preserve">Projects — </w:t>
-      </w:r>
-      <w:r>
-        <w:rPr>
-          <w:rFonts w:ascii="Aptos" w:cs="Aptos" w:eastAsia="Aptos" w:hAnsi="Aptos"/>
-          <w:color w:val="26332E"/>
-          <w:sz w:val="20"/>
-          <w:szCs w:val="20"/>
-        </w:rPr>
-        <w:t xml:space="preserve">Showcases three applications with brief summaries: SOS Disaster Management App focuses on access to alerts, emergency requests, and response information; Spec to RTL Conversion Application explores turning hardware specifications into RTL; VeriMed Application focuses on easier access to medical information and verification. Add the actual technologies used for each project before submission.</w:t>
-      </w:r>
+        <w:t xml:space="preserve">SOS Disaster Management App — </w:t>
+      </w:r>
+      <w:r>
+        <w:rPr>
+          <w:rFonts w:ascii="Aptos" w:cs="Aptos" w:eastAsia="Aptos" w:hAnsi="Aptos"/>
+          <w:color w:val="26332E"/>
+          <w:sz w:val="20"/>
+          <w:szCs w:val="20"/>
+        </w:rPr>
+        <w:t xml:space="preserve">Marked under progress; the concept focuses on disaster alerts, emergency requests, and response information.</w:t>
+      </w:r>
+    </w:p>
+    <w:p>
+      <w:pPr>
+        <w:pStyle w:val="ListParagraph"/>
+        <w:numPr>
+          <w:ilvl/>
+          <w:numId w:val="1"/>
+        </w:numPr>
+        <w:spacing w:after="85" w:line="270"/>
+      </w:pPr>
+      <w:r>
+        <w:rPr>
+          <w:rFonts w:ascii="Aptos" w:cs="Aptos" w:eastAsia="Aptos" w:hAnsi="Aptos"/>
+          <w:b/>
+          <w:bCs/>
+          <w:color w:val="10231F"/>
+          <w:sz w:val="20"/>
+          <w:szCs w:val="20"/>
+        </w:rPr>
+        <w:t xml:space="preserve">Spec to RTL Conversion Application — </w:t>
+      </w:r>
+      <w:r>
+        <w:rPr>
+          <w:rFonts w:ascii="Aptos" w:cs="Aptos" w:eastAsia="Aptos" w:hAnsi="Aptos"/>
+          <w:color w:val="26332E"/>
+          <w:sz w:val="20"/>
+          <w:szCs w:val="20"/>
+        </w:rPr>
+        <w:t xml:space="preserve">Explores converting hardware specifications into RTL. </w:t>
+      </w:r>
+      <w:hyperlink w:history="1" r:id="rIdzyjo2pxvlgkftbhygusow">
+        <w:r>
+          <w:rPr>
+            <w:rStyle w:val="Hyperlink"/>
+            <w:rFonts w:ascii="Aptos" w:cs="Aptos" w:eastAsia="Aptos" w:hAnsi="Aptos"/>
+            <w:color w:val="16846A"/>
+            <w:sz w:val="20"/>
+            <w:szCs w:val="20"/>
+            <w:u w:val="single"/>
+          </w:rPr>
+          <w:t xml:space="preserve">GitHub repository</w:t>
+        </w:r>
+      </w:hyperlink>
+    </w:p>
+    <w:p>
+      <w:pPr>
+        <w:pStyle w:val="ListParagraph"/>
+        <w:numPr>
+          <w:ilvl/>
+          <w:numId w:val="1"/>
+        </w:numPr>
+        <w:spacing w:after="85" w:line="270"/>
+      </w:pPr>
+      <w:r>
+        <w:rPr>
+          <w:rFonts w:ascii="Aptos" w:cs="Aptos" w:eastAsia="Aptos" w:hAnsi="Aptos"/>
+          <w:b/>
+          <w:bCs/>
+          <w:color w:val="10231F"/>
+          <w:sz w:val="20"/>
+          <w:szCs w:val="20"/>
+        </w:rPr>
+        <w:t xml:space="preserve">VeriMed Application — </w:t>
+      </w:r>
+      <w:r>
+        <w:rPr>
+          <w:rFonts w:ascii="Aptos" w:cs="Aptos" w:eastAsia="Aptos" w:hAnsi="Aptos"/>
+          <w:color w:val="26332E"/>
+          <w:sz w:val="20"/>
+          <w:szCs w:val="20"/>
+        </w:rPr>
+        <w:t xml:space="preserve">A healthcare application focused on access to medical information and verification. </w:t>
+      </w:r>
+      <w:hyperlink w:history="1" r:id="rIdb0spcjqv8kl528brrbyhz">
+        <w:r>
+          <w:rPr>
+            <w:rStyle w:val="Hyperlink"/>
+            <w:rFonts w:ascii="Aptos" w:cs="Aptos" w:eastAsia="Aptos" w:hAnsi="Aptos"/>
+            <w:color w:val="16846A"/>
+            <w:sz w:val="20"/>
+            <w:szCs w:val="20"/>
+            <w:u w:val="single"/>
+          </w:rPr>
+          <w:t xml:space="preserve">GitHub repository</w:t>
+        </w:r>
+      </w:hyperlink>
     </w:p>
     <w:p>
       <w:pPr>
@@ -305,7 +391,7 @@
         </w:numPr>
         <w:spacing w:after="70" w:line="260"/>
       </w:pPr>
-      <w:hyperlink w:history="1" r:id="rIdibps3cs7ckjegdzsz4ysp">
+      <w:hyperlink w:history="1" r:id="rIdck-w9cbz68i2b-n8kiczn">
         <w:r>
           <w:rPr>
             <w:rStyle w:val="Hyperlink"/>
@@ -337,7 +423,7 @@
         </w:numPr>
         <w:spacing w:after="70" w:line="260"/>
       </w:pPr>
-      <w:hyperlink w:history="1" r:id="rId80twwtdefpx0t_0qudpsz">
+      <w:hyperlink w:history="1" r:id="rId_kraiz-0aohhf-ey_bb_3">
         <w:r>
           <w:rPr>
             <w:rStyle w:val="Hyperlink"/>
@@ -369,7 +455,7 @@
         </w:numPr>
         <w:spacing w:after="70" w:line="260"/>
       </w:pPr>
-      <w:hyperlink w:history="1" r:id="rIdq5yaaq3e2a4znrn-_i-rk">
+      <w:hyperlink w:history="1" r:id="rId76pszxrd_q4ayrs4brlad">
         <w:r>
           <w:rPr>
             <w:rStyle w:val="Hyperlink"/>
@@ -401,7 +487,7 @@
         </w:numPr>
         <w:spacing w:after="70" w:line="260"/>
       </w:pPr>
-      <w:hyperlink w:history="1" r:id="rId4owcburbglp1xxlkpk4nz">
+      <w:hyperlink w:history="1" r:id="rIdm-vk2l-nh3djyatlog9do">
         <w:r>
           <w:rPr>
             <w:rStyle w:val="Hyperlink"/>
@@ -433,7 +519,7 @@
         </w:numPr>
         <w:spacing w:after="70" w:line="260"/>
       </w:pPr>
-      <w:hyperlink w:history="1" r:id="rIddt6cv4qa_ymweob7t1kif">
+      <w:hyperlink w:history="1" r:id="rIdor6c7ugdtlveusjxsg9dj">
         <w:r>
           <w:rPr>
             <w:rStyle w:val="Hyperlink"/>
@@ -852,7 +938,7 @@
         </w:rPr>
         <w:t xml:space="preserve">Live website: </w:t>
       </w:r>
-      <w:hyperlink w:history="1" r:id="rId_xxfd1obv6yxnph_uj-3f">
+      <w:hyperlink w:history="1" r:id="rIdza4jvfij7hn_rkkedi3rt">
         <w:r>
           <w:rPr>
             <w:rStyle w:val="Hyperlink"/>
@@ -886,7 +972,7 @@
         </w:rPr>
         <w:t xml:space="preserve">GitHub: </w:t>
       </w:r>
-      <w:hyperlink w:history="1" r:id="rIdyoyaefzipnumwrwbt9ul0">
+      <w:hyperlink w:history="1" r:id="rIdeyyuw504_leiggpshwpgh">
         <w:r>
           <w:rPr>
             <w:rStyle w:val="Hyperlink"/>
@@ -922,7 +1008,7 @@
           <w:sz w:val="18"/>
           <w:szCs w:val="18"/>
         </w:rPr>
-        <w:t xml:space="preserve">add the actual technology stack used for each project.</w:t>
+        <w:t xml:space="preserve">add technology details as each application is finalized.</w:t>
       </w:r>
     </w:p>
     <w:sectPr>

</xml_diff>